<commit_message>
Update application answers and documentation for CDC-RFA-JG-26-0054. Enhanced project narrative pack with new titles, critical details, and shared win sections. Improved clarity on funding and local partner preferences. Updated links and added NSSF number for compliance. Refined project abstract to emphasize Uganda's health security needs and FairBanks' role in addressing them.
</commit_message>
<xml_diff>
--- a/applications/cdc-uganda-ghs/documents/cdc-uganda-ghs_word.docx
+++ b/applications/cdc-uganda-ghs/documents/cdc-uganda-ghs_word.docx
@@ -31,7 +31,7 @@
           <w:color w:val="1E2F38"/>
           <w:sz w:val="28"/>
         </w:rPr>
-        <w:t>Project Narrative Pack (submission companion)</w:t>
+        <w:t>Win-ready project narrative pack (submission companion)</w:t>
       </w:r>
     </w:p>
     <w:p>
@@ -242,6 +242,44 @@
                 <w:sz w:val="20"/>
               </w:rPr>
               <w:t>FAIRBANKS MEDICAL CENTRE LIMITED</w:t>
+            </w:r>
+          </w:p>
+        </w:tc>
+      </w:tr>
+      <w:tr>
+        <w:tc>
+          <w:tcPr>
+            <w:tcW w:type="dxa" w:w="4680"/>
+          </w:tcPr>
+          <w:p>
+            <w:r/>
+            <w:r>
+              <w:rPr>
+                <w:rFonts w:ascii="Times New Roman" w:hAnsi="Times New Roman" w:eastAsia="Times New Roman"/>
+                <w:b w:val="0"/>
+                <w:i w:val="0"/>
+                <w:color w:val="1E2F38"/>
+                <w:sz w:val="20"/>
+              </w:rPr>
+              <w:t>Company No. / TIN / NSSF</w:t>
+            </w:r>
+          </w:p>
+        </w:tc>
+        <w:tc>
+          <w:tcPr>
+            <w:tcW w:type="dxa" w:w="4680"/>
+          </w:tcPr>
+          <w:p>
+            <w:r/>
+            <w:r>
+              <w:rPr>
+                <w:rFonts w:ascii="Times New Roman" w:hAnsi="Times New Roman" w:eastAsia="Times New Roman"/>
+                <w:b w:val="0"/>
+                <w:i w:val="0"/>
+                <w:color w:val="1E2F38"/>
+                <w:sz w:val="20"/>
+              </w:rPr>
+              <w:t>80020003843337 · 1053370026 · NS043295</w:t>
             </w:r>
           </w:p>
         </w:tc>
@@ -507,7 +545,45 @@
                 <w:color w:val="1E2F38"/>
                 <w:sz w:val="20"/>
               </w:rPr>
-              <w:t>Yes — Uganda-incorporated entity (document before submit)</w:t>
+              <w:t>Yes — Uganda-incorporated entity (+15 points; document before submit)</w:t>
+            </w:r>
+          </w:p>
+        </w:tc>
+      </w:tr>
+      <w:tr>
+        <w:tc>
+          <w:tcPr>
+            <w:tcW w:type="dxa" w:w="4680"/>
+          </w:tcPr>
+          <w:p>
+            <w:r/>
+            <w:r>
+              <w:rPr>
+                <w:rFonts w:ascii="Times New Roman" w:hAnsi="Times New Roman" w:eastAsia="Times New Roman"/>
+                <w:b w:val="0"/>
+                <w:i w:val="0"/>
+                <w:color w:val="1E2F38"/>
+                <w:sz w:val="20"/>
+              </w:rPr>
+              <w:t>Merit scoring focus</w:t>
+            </w:r>
+          </w:p>
+        </w:tc>
+        <w:tc>
+          <w:tcPr>
+            <w:tcW w:type="dxa" w:w="4680"/>
+          </w:tcPr>
+          <w:p>
+            <w:r/>
+            <w:r>
+              <w:rPr>
+                <w:rFonts w:ascii="Times New Roman" w:hAnsi="Times New Roman" w:eastAsia="Times New Roman"/>
+                <w:b w:val="0"/>
+                <w:i w:val="0"/>
+                <w:color w:val="1E2F38"/>
+                <w:sz w:val="20"/>
+              </w:rPr>
+              <w:t>Approach 35 · EPMP 40 · Capacity 25</w:t>
             </w:r>
           </w:p>
         </w:tc>
@@ -602,6 +678,240 @@
           <w:color w:val="1E2F38"/>
           <w:sz w:val="24"/>
         </w:rPr>
+        <w:t>Shared win</w:t>
+      </w:r>
+    </w:p>
+    <w:tbl>
+      <w:tblPr>
+        <w:tblStyle w:val="TableGrid"/>
+        <w:tblW w:type="auto" w:w="0"/>
+        <w:tblLook w:firstColumn="1" w:firstRow="1" w:lastColumn="0" w:lastRow="0" w:noHBand="0" w:noVBand="1" w:val="04A0"/>
+      </w:tblPr>
+      <w:tblGrid>
+        <w:gridCol w:w="4680"/>
+        <w:gridCol w:w="4680"/>
+      </w:tblGrid>
+      <w:tr>
+        <w:tc>
+          <w:tcPr>
+            <w:tcW w:type="dxa" w:w="4680"/>
+            <w:shd w:fill="F7F5F0"/>
+          </w:tcPr>
+          <w:p>
+            <w:r/>
+            <w:r>
+              <w:rPr>
+                <w:rFonts w:ascii="Times New Roman" w:hAnsi="Times New Roman" w:eastAsia="Times New Roman"/>
+                <w:b/>
+                <w:i w:val="0"/>
+                <w:color w:val="1E2F38"/>
+                <w:sz w:val="20"/>
+              </w:rPr>
+              <w:t>Who</w:t>
+            </w:r>
+          </w:p>
+        </w:tc>
+        <w:tc>
+          <w:tcPr>
+            <w:tcW w:type="dxa" w:w="4680"/>
+            <w:shd w:fill="F7F5F0"/>
+          </w:tcPr>
+          <w:p>
+            <w:r/>
+            <w:r>
+              <w:rPr>
+                <w:rFonts w:ascii="Times New Roman" w:hAnsi="Times New Roman" w:eastAsia="Times New Roman"/>
+                <w:b/>
+                <w:i w:val="0"/>
+                <w:color w:val="1E2F38"/>
+                <w:sz w:val="20"/>
+              </w:rPr>
+              <w:t>What they gain</w:t>
+            </w:r>
+          </w:p>
+        </w:tc>
+      </w:tr>
+      <w:tr>
+        <w:tc>
+          <w:tcPr>
+            <w:tcW w:type="dxa" w:w="4680"/>
+          </w:tcPr>
+          <w:p>
+            <w:r/>
+            <w:r>
+              <w:rPr>
+                <w:rFonts w:ascii="Times New Roman" w:hAnsi="Times New Roman" w:eastAsia="Times New Roman"/>
+                <w:b w:val="0"/>
+                <w:i w:val="0"/>
+                <w:color w:val="1E2F38"/>
+                <w:sz w:val="20"/>
+              </w:rPr>
+              <w:t>CDC / United States</w:t>
+            </w:r>
+          </w:p>
+        </w:tc>
+        <w:tc>
+          <w:tcPr>
+            <w:tcW w:type="dxa" w:w="4680"/>
+          </w:tcPr>
+          <w:p>
+            <w:r/>
+            <w:r>
+              <w:rPr>
+                <w:rFonts w:ascii="Times New Roman" w:hAnsi="Times New Roman" w:eastAsia="Times New Roman"/>
+                <w:b w:val="0"/>
+                <w:i w:val="0"/>
+                <w:color w:val="1E2F38"/>
+                <w:sz w:val="20"/>
+              </w:rPr>
+              <w:t>Earlier containment at source — Safer, Stronger, More Prosperous</w:t>
+            </w:r>
+          </w:p>
+        </w:tc>
+      </w:tr>
+      <w:tr>
+        <w:tc>
+          <w:tcPr>
+            <w:tcW w:type="dxa" w:w="4680"/>
+          </w:tcPr>
+          <w:p>
+            <w:r/>
+            <w:r>
+              <w:rPr>
+                <w:rFonts w:ascii="Times New Roman" w:hAnsi="Times New Roman" w:eastAsia="Times New Roman"/>
+                <w:b w:val="0"/>
+                <w:i w:val="0"/>
+                <w:color w:val="1E2F38"/>
+                <w:sz w:val="20"/>
+              </w:rPr>
+              <w:t>Uganda / MoH</w:t>
+            </w:r>
+          </w:p>
+        </w:tc>
+        <w:tc>
+          <w:tcPr>
+            <w:tcW w:type="dxa" w:w="4680"/>
+          </w:tcPr>
+          <w:p>
+            <w:r/>
+            <w:r>
+              <w:rPr>
+                <w:rFonts w:ascii="Times New Roman" w:hAnsi="Times New Roman" w:eastAsia="Times New Roman"/>
+                <w:b w:val="0"/>
+                <w:i w:val="0"/>
+                <w:color w:val="1E2F38"/>
+                <w:sz w:val="20"/>
+              </w:rPr>
+              <w:t>Last-mile signals into NISS/NAPHS II; trained CHWs; 7-1-7 practice</w:t>
+            </w:r>
+          </w:p>
+        </w:tc>
+      </w:tr>
+      <w:tr>
+        <w:tc>
+          <w:tcPr>
+            <w:tcW w:type="dxa" w:w="4680"/>
+          </w:tcPr>
+          <w:p>
+            <w:r/>
+            <w:r>
+              <w:rPr>
+                <w:rFonts w:ascii="Times New Roman" w:hAnsi="Times New Roman" w:eastAsia="Times New Roman"/>
+                <w:b w:val="0"/>
+                <w:i w:val="0"/>
+                <w:color w:val="1E2F38"/>
+                <w:sz w:val="20"/>
+              </w:rPr>
+              <w:t>FairBanks</w:t>
+            </w:r>
+          </w:p>
+        </w:tc>
+        <w:tc>
+          <w:tcPr>
+            <w:tcW w:type="dxa" w:w="4680"/>
+          </w:tcPr>
+          <w:p>
+            <w:r/>
+            <w:r>
+              <w:rPr>
+                <w:rFonts w:ascii="Times New Roman" w:hAnsi="Times New Roman" w:eastAsia="Times New Roman"/>
+                <w:b w:val="0"/>
+                <w:i w:val="0"/>
+                <w:color w:val="1E2F38"/>
+                <w:sz w:val="20"/>
+              </w:rPr>
+              <w:t>Local partner with live clinic, Community Reach, and FCHIP that feeds government</w:t>
+            </w:r>
+          </w:p>
+        </w:tc>
+      </w:tr>
+      <w:tr>
+        <w:tc>
+          <w:tcPr>
+            <w:tcW w:type="dxa" w:w="4680"/>
+          </w:tcPr>
+          <w:p>
+            <w:r/>
+            <w:r>
+              <w:rPr>
+                <w:rFonts w:ascii="Times New Roman" w:hAnsi="Times New Roman" w:eastAsia="Times New Roman"/>
+                <w:b w:val="0"/>
+                <w:i w:val="0"/>
+                <w:color w:val="1E2F38"/>
+                <w:sz w:val="20"/>
+              </w:rPr>
+              <w:t>Communities</w:t>
+            </w:r>
+          </w:p>
+        </w:tc>
+        <w:tc>
+          <w:tcPr>
+            <w:tcW w:type="dxa" w:w="4680"/>
+          </w:tcPr>
+          <w:p>
+            <w:r/>
+            <w:r>
+              <w:rPr>
+                <w:rFonts w:ascii="Times New Roman" w:hAnsi="Times New Roman" w:eastAsia="Times New Roman"/>
+                <w:b w:val="0"/>
+                <w:i w:val="0"/>
+                <w:color w:val="1E2F38"/>
+                <w:sz w:val="20"/>
+              </w:rPr>
+              <w:t>Earlier alerts and clearer referral paths when something looks wrong</w:t>
+            </w:r>
+          </w:p>
+        </w:tc>
+      </w:tr>
+    </w:tbl>
+    <w:p/>
+    <w:p>
+      <w:pPr>
+        <w:spacing w:after="120" w:before="0"/>
+      </w:pPr>
+      <w:r>
+        <w:rPr>
+          <w:rFonts w:ascii="Times New Roman" w:hAnsi="Times New Roman" w:eastAsia="Times New Roman"/>
+          <w:b w:val="0"/>
+          <w:i w:val="0"/>
+          <w:color w:val="1E2F38"/>
+          <w:sz w:val="24"/>
+        </w:rPr>
+        <w:t>CDC and Uganda need outbreaks stopped closer to where people live. FairBanks already runs a clinic, CHW/VHT outreach, and working FCHIP tools — ready to feed MoH/NISS pathways under government leadership.</w:t>
+      </w:r>
+    </w:p>
+    <w:p>
+      <w:pPr>
+        <w:spacing w:after="160" w:before="0"/>
+      </w:pPr>
+      <w:r>
+        <w:rPr>
+          <w:rFonts w:ascii="Times New Roman" w:hAnsi="Times New Roman" w:eastAsia="Times New Roman"/>
+          <w:b/>
+          <w:i w:val="0"/>
+          <w:color w:val="1E2F38"/>
+          <w:sz w:val="24"/>
+        </w:rPr>
         <w:t>Project abstract summary</w:t>
       </w:r>
     </w:p>
@@ -617,7 +927,7 @@
           <w:color w:val="1E2F38"/>
           <w:sz w:val="24"/>
         </w:rPr>
-        <w:t>FAIRBANKS MEDICAL CENTRE LIMITED (FairBanks Medical Centre) is a Uganda-registered health organisation in Kampala. We run a licensed medical centre and FairBanks Community Reach with CHWs and VHTs in Bukoto, Kyebando, Kisaasi, Kamwokya, Kikaaya and nearby communities. Slogan: Your health, our mission. This project helps Uganda close last-mile Global Health Security gaps flagged by the 2023 Joint External Evaluation: community and facility signals that reach decision-makers too late; limited surge-ready workforce at subnational level; and incomplete links into national surveillance and emergency structures, including National Integrated Surveillance System (NISS) pathways. Under Ministry of Health leadership, Year 1 Component 1 will (1) strengthen community and facility surveillance that contributes to MoH/NISS channels using FairBanks FCHIP tools, (2) speed community-to-district detection and response using 7-1-7 style timing, (3) train CHWs/VHTs and frontline workers for One Health–aware surveillance and surge readiness, and (4) tighten community–facility links for priority diseases during routine work and outbreaks. Laboratory and border-health modules will be delivered with MoH-aligned partners. Components 2–5 are contingency surge plans that may be approved but unfunded until CDC activates emergency funding.</w:t>
+        <w:t>FAIRBANKS MEDICAL CENTRE LIMITED (FairBanks Medical Centre) is a Uganda-registered health organisation in Kampala. We run a licensed medical centre and FairBanks Community Reach with CHWs and VHTs in Bukoto, Kyebando, Kisaasi, Kamwokya, Kikaaya and nearby communities. Slogan: Your health, our mission. Uganda’s 2023 Joint External Evaluation still flags last-mile gaps: community and facility signals that reach decision-makers too late; limited surge-ready workforce at subnational level; and incomplete links into national surveillance and emergency structures, including National Integrated Surveillance System (NISS) pathways. Under Ministry of Health leadership, Year 1 Component 1 will (1) strengthen community and facility surveillance that contributes to MoH/NISS channels using FairBanks FCHIP tools, (2) speed community-to-district detection and response using 7-1-7 style timing, (3) train CHWs/VHTs and frontline workers for One Health–aware surveillance and surge readiness, and (4) tighten community–facility links for priority diseases during routine work and outbreaks. Laboratory and border-health modules will be delivered with MoH-aligned partners. Components 2–5 are contingency surge plans that may be approved but unfunded until CDC activates emergency funding. Shared result: threats found and acted on closer to source — safer for Uganda and for the United States.</w:t>
       </w:r>
     </w:p>
     <w:p>
@@ -707,7 +1017,22 @@
           <w:color w:val="1E2F38"/>
           <w:sz w:val="24"/>
         </w:rPr>
-        <w:t>FairBanks Community Reach cascade stays the operating model: community members → CHWs/VHTs → Community Reach programmes → Medical Centre → research and skills → economic empowerment. FCHIP is the intelligence component on the Data &amp; Feedback loop.</w:t>
+        <w:t>CDC and Uganda need outbreaks stopped closer to where people live. FairBanks already runs a clinic, CHW/VHT outreach, and working FCHIP tools — ready to feed MoH/NISS pathways under government leadership.</w:t>
+      </w:r>
+    </w:p>
+    <w:p>
+      <w:pPr>
+        <w:spacing w:after="120" w:before="0"/>
+      </w:pPr>
+      <w:r>
+        <w:rPr>
+          <w:rFonts w:ascii="Times New Roman" w:hAnsi="Times New Roman" w:eastAsia="Times New Roman"/>
+          <w:b w:val="0"/>
+          <w:i w:val="0"/>
+          <w:color w:val="1E2F38"/>
+          <w:sz w:val="24"/>
+        </w:rPr>
+        <w:t>FairBanks Community Reach cascade stays the operating model: community members -&gt; CHWs/VHTs -&gt; Community Reach programmes -&gt; Medical Centre -&gt; research and skills -&gt; economic empowerment. FCHIP is the intelligence component on the Data &amp; Feedback loop.</w:t>
       </w:r>
     </w:p>
     <w:p>
@@ -1003,7 +1328,7 @@
                 <w:color w:val="1E2F38"/>
                 <w:sz w:val="20"/>
               </w:rPr>
-              <w:t>FCHIP capture → MoH/NISS-aligned exports; data quality; simple GIS early warning</w:t>
+              <w:t>FCHIP capture -&gt; MoH/NISS-aligned exports; data quality; simple GIS early warning</w:t>
             </w:r>
           </w:p>
         </w:tc>
@@ -1385,7 +1710,7 @@
           <w:color w:val="1E2F38"/>
           <w:sz w:val="24"/>
         </w:rPr>
-        <w:t>Project measures: median days signal→notify; CHWs submitting complete weekly reports; completed priority referrals; successful MoH export tests; AARs after drills/events.</w:t>
+        <w:t>Project measures with Year 1 targets: median days signal-to-notify (toward 7-1-7); at least 80% active CHWs with complete weekly reports by Q4; at least 70% priority referrals documented; at least 2 successful MoH export tests; at least 2 AARs.</w:t>
       </w:r>
     </w:p>
     <w:p>
@@ -1445,7 +1770,7 @@
           <w:color w:val="1E2F38"/>
           <w:sz w:val="24"/>
         </w:rPr>
-        <w:t>FAIRBANKS MEDICAL CENTRE LIMITED (No. 80020003843337; TIN 1053370026) — Uganda company with principal place of business in Kampala.</w:t>
+        <w:t>FAIRBANKS MEDICAL CENTRE LIMITED (No. 80020003843337; TIN 1053370026; NSSF NS043295) — Uganda company with principal place of business in Kampala.</w:t>
       </w:r>
     </w:p>
     <w:p>
@@ -1490,7 +1815,22 @@
           <w:color w:val="1E2F38"/>
           <w:sz w:val="24"/>
         </w:rPr>
-        <w:t>Lead: Racheal Nabukeera, Managing Director and Co-founder — 15+ years in Uganda private health leadership.</w:t>
+        <w:t>Lead: Racheal Nabukeera, Managing Director and Co-founder — 15+ years in Uganda private health leadership; MA Social Sector Planning (Makerere); PhD in progress; Uganda Healthcare Federation links.</w:t>
+      </w:r>
+    </w:p>
+    <w:p>
+      <w:pPr>
+        <w:pStyle w:val="ListBullet"/>
+      </w:pPr>
+      <w:r>
+        <w:rPr>
+          <w:rFonts w:ascii="Times New Roman" w:hAnsi="Times New Roman" w:eastAsia="Times New Roman"/>
+          <w:b w:val="0"/>
+          <w:i w:val="0"/>
+          <w:color w:val="1E2F38"/>
+          <w:sz w:val="24"/>
+        </w:rPr>
+        <w:t>Company evidence pack available (incorporation, TIN, NSSF, licences, insurance) — see company-docs/.</w:t>
       </w:r>
     </w:p>
     <w:p>
@@ -2057,7 +2397,7 @@
           <w:color w:val="1E2F38"/>
           <w:sz w:val="24"/>
         </w:rPr>
-        <w:t>SAM.gov active + UEI for physical location receiving funds</w:t>
+        <w:t>SAM.gov active + UEI for physical location receiving funds (start now)</w:t>
       </w:r>
     </w:p>
     <w:p>
@@ -2072,7 +2412,7 @@
           <w:color w:val="1E2F38"/>
           <w:sz w:val="24"/>
         </w:rPr>
-        <w:t>Grants.gov / Login.gov active; authorised official ready to certify</w:t>
+        <w:t>Grants.gov / Login.gov active; AOR ready to Sign and Submit</w:t>
       </w:r>
     </w:p>
     <w:p>
@@ -2087,7 +2427,22 @@
           <w:color w:val="1E2F38"/>
           <w:sz w:val="24"/>
         </w:rPr>
-        <w:t>Local partner letter + ownership/staff/board citizenship evidence</w:t>
+        <w:t>Follow applicant quick start: https://grants.gov/quick-start-guide/applicants</w:t>
+      </w:r>
+    </w:p>
+    <w:p>
+      <w:pPr>
+        <w:pStyle w:val="ListBullet"/>
+      </w:pPr>
+      <w:r>
+        <w:rPr>
+          <w:rFonts w:ascii="Times New Roman" w:hAnsi="Times New Roman" w:eastAsia="Times New Roman"/>
+          <w:b w:val="0"/>
+          <w:i w:val="0"/>
+          <w:color w:val="1E2F38"/>
+          <w:sz w:val="24"/>
+        </w:rPr>
+        <w:t>Local partner letter + ownership/staff/board citizenship evidence from company-docs/</w:t>
       </w:r>
     </w:p>
     <w:p>
@@ -2147,7 +2502,22 @@
           <w:color w:val="1E2F38"/>
           <w:sz w:val="24"/>
         </w:rPr>
-        <w:t>Official listing: https://simpler.grants.gov/opportunity/264249e6-fdbb-4b1c-ac90-23b7d9b07b1b</w:t>
+        <w:t>Official listing: https://www.grants.gov/search-results-detail/360339</w:t>
+      </w:r>
+    </w:p>
+    <w:p>
+      <w:pPr>
+        <w:pStyle w:val="ListBullet"/>
+      </w:pPr>
+      <w:r>
+        <w:rPr>
+          <w:rFonts w:ascii="Times New Roman" w:hAnsi="Times New Roman" w:eastAsia="Times New Roman"/>
+          <w:b w:val="0"/>
+          <w:i w:val="0"/>
+          <w:color w:val="1E2F38"/>
+          <w:sz w:val="24"/>
+        </w:rPr>
+        <w:t>Alt listing: https://simpler.grants.gov/opportunity/264249e6-fdbb-4b1c-ac90-23b7d9b07b1b</w:t>
       </w:r>
     </w:p>
     <w:p>
@@ -2162,7 +2532,7 @@
           <w:color w:val="52636C"/>
           <w:sz w:val="20"/>
         </w:rPr>
-        <w:t>Full copy-paste bank: application_answers.md. Generated 2026-07-30.</w:t>
+        <w:t>Full copy-paste bank: application_answers.md. Generated 2026-08-09.</w:t>
       </w:r>
     </w:p>
     <w:p>

</xml_diff>

<commit_message>
Update budget figures and application documents for CDC-RFA-JG-26-0054. Revised Year 1 federal ask to $3,300,000, with detailed adjustments across all components, including a reduction in funding for Core GHS and contingency components. Enhanced clarity in budget narratives and application forms to ensure compliance with Grants.gov requirements.
</commit_message>
<xml_diff>
--- a/applications/cdc-uganda-ghs/documents/cdc-uganda-ghs_word.docx
+++ b/applications/cdc-uganda-ghs/documents/cdc-uganda-ghs_word.docx
@@ -451,6 +451,44 @@
                 <w:color w:val="1E2F38"/>
                 <w:sz w:val="20"/>
               </w:rPr>
+              <w:t>Year 1 total federal ask (draft)</w:t>
+            </w:r>
+          </w:p>
+        </w:tc>
+        <w:tc>
+          <w:tcPr>
+            <w:tcW w:type="dxa" w:w="4680"/>
+          </w:tcPr>
+          <w:p>
+            <w:r/>
+            <w:r>
+              <w:rPr>
+                <w:rFonts w:ascii="Times New Roman" w:hAnsi="Times New Roman" w:eastAsia="Times New Roman"/>
+                <w:b w:val="0"/>
+                <w:i w:val="0"/>
+                <w:color w:val="1E2F38"/>
+                <w:sz w:val="20"/>
+              </w:rPr>
+              <w:t>$3,300,000 (CONFIRM; all components)</w:t>
+            </w:r>
+          </w:p>
+        </w:tc>
+      </w:tr>
+      <w:tr>
+        <w:tc>
+          <w:tcPr>
+            <w:tcW w:type="dxa" w:w="4680"/>
+          </w:tcPr>
+          <w:p>
+            <w:r/>
+            <w:r>
+              <w:rPr>
+                <w:rFonts w:ascii="Times New Roman" w:hAnsi="Times New Roman" w:eastAsia="Times New Roman"/>
+                <w:b w:val="0"/>
+                <w:i w:val="0"/>
+                <w:color w:val="1E2F38"/>
+                <w:sz w:val="20"/>
+              </w:rPr>
               <w:t>Year 1 Component 1 ask (draft)</w:t>
             </w:r>
           </w:p>
@@ -469,7 +507,7 @@
                 <w:color w:val="1E2F38"/>
                 <w:sz w:val="20"/>
               </w:rPr>
-              <w:t>$2,450,000 (CONFIRM; ceiling $5,000,000)</w:t>
+              <w:t>$1,850,000 (CONFIRM; ceiling $5,000,000)</w:t>
             </w:r>
           </w:p>
         </w:tc>
@@ -2016,7 +2054,7 @@
                 <w:color w:val="1E2F38"/>
                 <w:sz w:val="20"/>
               </w:rPr>
-              <w:t>$2,450,000</w:t>
+              <w:t>$1,850,000</w:t>
             </w:r>
           </w:p>
         </w:tc>
@@ -2090,7 +2128,7 @@
                 <w:color w:val="1E2F38"/>
                 <w:sz w:val="20"/>
               </w:rPr>
-              <w:t>$1,800,000</w:t>
+              <w:t>$400,000</w:t>
             </w:r>
           </w:p>
         </w:tc>
@@ -2164,7 +2202,7 @@
                 <w:color w:val="1E2F38"/>
                 <w:sz w:val="20"/>
               </w:rPr>
-              <w:t>$2,750,000</w:t>
+              <w:t>$500,000</w:t>
             </w:r>
           </w:p>
         </w:tc>
@@ -2238,7 +2276,7 @@
                 <w:color w:val="1E2F38"/>
                 <w:sz w:val="20"/>
               </w:rPr>
-              <w:t>$1,500,000</w:t>
+              <w:t>$275,000</w:t>
             </w:r>
           </w:p>
         </w:tc>
@@ -2312,7 +2350,7 @@
                 <w:color w:val="1E2F38"/>
                 <w:sz w:val="20"/>
               </w:rPr>
-              <w:t>$1,500,000</w:t>
+              <w:t>$275,000</w:t>
             </w:r>
           </w:p>
         </w:tc>
@@ -2349,6 +2387,79 @@
                 <w:sz w:val="20"/>
               </w:rPr>
               <w:t>Contingency</w:t>
+            </w:r>
+          </w:p>
+        </w:tc>
+      </w:tr>
+      <w:tr>
+        <w:tc>
+          <w:tcPr>
+            <w:tcW w:type="dxa" w:w="2340"/>
+          </w:tcPr>
+          <w:p>
+            <w:r/>
+            <w:r>
+              <w:rPr>
+                <w:rFonts w:ascii="Times New Roman" w:hAnsi="Times New Roman" w:eastAsia="Times New Roman"/>
+                <w:b w:val="0"/>
+                <w:i w:val="0"/>
+                <w:color w:val="1E2F38"/>
+                <w:sz w:val="20"/>
+              </w:rPr>
+              <w:t>TOTAL Year 1</w:t>
+            </w:r>
+          </w:p>
+        </w:tc>
+        <w:tc>
+          <w:tcPr>
+            <w:tcW w:type="dxa" w:w="2340"/>
+          </w:tcPr>
+          <w:p>
+            <w:r/>
+            <w:r>
+              <w:rPr>
+                <w:rFonts w:ascii="Times New Roman" w:hAnsi="Times New Roman" w:eastAsia="Times New Roman"/>
+                <w:b w:val="0"/>
+                <w:i w:val="0"/>
+                <w:color w:val="1E2F38"/>
+                <w:sz w:val="20"/>
+              </w:rPr>
+              <w:t>$3,300,000</w:t>
+            </w:r>
+          </w:p>
+        </w:tc>
+        <w:tc>
+          <w:tcPr>
+            <w:tcW w:type="dxa" w:w="2340"/>
+          </w:tcPr>
+          <w:p>
+            <w:r/>
+            <w:r>
+              <w:rPr>
+                <w:rFonts w:ascii="Times New Roman" w:hAnsi="Times New Roman" w:eastAsia="Times New Roman"/>
+                <w:b w:val="0"/>
+                <w:i w:val="0"/>
+                <w:color w:val="1E2F38"/>
+                <w:sz w:val="20"/>
+              </w:rPr>
+            </w:r>
+          </w:p>
+        </w:tc>
+        <w:tc>
+          <w:tcPr>
+            <w:tcW w:type="dxa" w:w="2340"/>
+          </w:tcPr>
+          <w:p>
+            <w:r/>
+            <w:r>
+              <w:rPr>
+                <w:rFonts w:ascii="Times New Roman" w:hAnsi="Times New Roman" w:eastAsia="Times New Roman"/>
+                <w:b w:val="0"/>
+                <w:i w:val="0"/>
+                <w:color w:val="1E2F38"/>
+                <w:sz w:val="20"/>
+              </w:rPr>
+              <w:t>All components</w:t>
             </w:r>
           </w:p>
         </w:tc>

</xml_diff>

<commit_message>
Update budget figures and application documents for CDC-RFA-JG-26-0054. Revised Year 1 federal ask to $3,300,000, with detailed adjustments across all components, including an increase in funding for Core GHS and modifications to contingency amounts. Enhanced clarity in budget narratives and application forms to ensure compliance with Grants.gov requirements.
</commit_message>
<xml_diff>
--- a/applications/cdc-uganda-ghs/documents/cdc-uganda-ghs_word.docx
+++ b/applications/cdc-uganda-ghs/documents/cdc-uganda-ghs_word.docx
@@ -507,7 +507,7 @@
                 <w:color w:val="1E2F38"/>
                 <w:sz w:val="20"/>
               </w:rPr>
-              <w:t>$1,850,000 (CONFIRM; ceiling $5,000,000)</w:t>
+              <w:t>$2,000,000 (CONFIRM; ceiling $5,000,000)</w:t>
             </w:r>
           </w:p>
         </w:tc>
@@ -2054,7 +2054,7 @@
                 <w:color w:val="1E2F38"/>
                 <w:sz w:val="20"/>
               </w:rPr>
-              <w:t>$1,850,000</w:t>
+              <w:t>$2,000,000</w:t>
             </w:r>
           </w:p>
         </w:tc>
@@ -2128,7 +2128,7 @@
                 <w:color w:val="1E2F38"/>
                 <w:sz w:val="20"/>
               </w:rPr>
-              <w:t>$400,000</w:t>
+              <w:t>$350,000</w:t>
             </w:r>
           </w:p>
         </w:tc>
@@ -2202,7 +2202,7 @@
                 <w:color w:val="1E2F38"/>
                 <w:sz w:val="20"/>
               </w:rPr>
-              <w:t>$500,000</w:t>
+              <w:t>$450,000</w:t>
             </w:r>
           </w:p>
         </w:tc>
@@ -2276,7 +2276,7 @@
                 <w:color w:val="1E2F38"/>
                 <w:sz w:val="20"/>
               </w:rPr>
-              <w:t>$275,000</w:t>
+              <w:t>$250,000</w:t>
             </w:r>
           </w:p>
         </w:tc>
@@ -2350,7 +2350,7 @@
                 <w:color w:val="1E2F38"/>
                 <w:sz w:val="20"/>
               </w:rPr>
-              <w:t>$275,000</w:t>
+              <w:t>$250,000</w:t>
             </w:r>
           </w:p>
         </w:tc>

</xml_diff>

<commit_message>
Update budget figures and application documents for CDC-RFA-JG-26-0054. Revised Year 1 federal ask to $3,300,000, with increased funding for Core GHS and adjustments to contingency amounts across components. Enhanced clarity in budget narratives and application forms to align with Grants.gov requirements, ensuring accurate representation of funding distribution and project goals.
</commit_message>
<xml_diff>
--- a/applications/cdc-uganda-ghs/documents/cdc-uganda-ghs_word.docx
+++ b/applications/cdc-uganda-ghs/documents/cdc-uganda-ghs_word.docx
@@ -507,7 +507,7 @@
                 <w:color w:val="1E2F38"/>
                 <w:sz w:val="20"/>
               </w:rPr>
-              <w:t>$2,000,000 (CONFIRM; ceiling $5,000,000)</w:t>
+              <w:t>$2,100,000 (CONFIRM; ceiling $5,000,000)</w:t>
             </w:r>
           </w:p>
         </w:tc>
@@ -2054,7 +2054,7 @@
                 <w:color w:val="1E2F38"/>
                 <w:sz w:val="20"/>
               </w:rPr>
-              <w:t>$2,000,000</w:t>
+              <w:t>$2,100,000</w:t>
             </w:r>
           </w:p>
         </w:tc>
@@ -2128,7 +2128,7 @@
                 <w:color w:val="1E2F38"/>
                 <w:sz w:val="20"/>
               </w:rPr>
-              <w:t>$350,000</w:t>
+              <w:t>$400,000</w:t>
             </w:r>
           </w:p>
         </w:tc>
@@ -2202,7 +2202,7 @@
                 <w:color w:val="1E2F38"/>
                 <w:sz w:val="20"/>
               </w:rPr>
-              <w:t>$450,000</w:t>
+              <w:t>$500,000</w:t>
             </w:r>
           </w:p>
         </w:tc>
@@ -2276,7 +2276,7 @@
                 <w:color w:val="1E2F38"/>
                 <w:sz w:val="20"/>
               </w:rPr>
-              <w:t>$250,000</w:t>
+              <w:t>$300,000</w:t>
             </w:r>
           </w:p>
         </w:tc>
@@ -2332,81 +2332,7 @@
                 <w:color w:val="1E2F38"/>
                 <w:sz w:val="20"/>
               </w:rPr>
-              <w:t>5 Humanitarian</w:t>
-            </w:r>
-          </w:p>
-        </w:tc>
-        <w:tc>
-          <w:tcPr>
-            <w:tcW w:type="dxa" w:w="2340"/>
-          </w:tcPr>
-          <w:p>
-            <w:r/>
-            <w:r>
-              <w:rPr>
-                <w:rFonts w:ascii="Times New Roman" w:hAnsi="Times New Roman" w:eastAsia="Times New Roman"/>
-                <w:b w:val="0"/>
-                <w:i w:val="0"/>
-                <w:color w:val="1E2F38"/>
-                <w:sz w:val="20"/>
-              </w:rPr>
-              <w:t>$250,000</w:t>
-            </w:r>
-          </w:p>
-        </w:tc>
-        <w:tc>
-          <w:tcPr>
-            <w:tcW w:type="dxa" w:w="2340"/>
-          </w:tcPr>
-          <w:p>
-            <w:r/>
-            <w:r>
-              <w:rPr>
-                <w:rFonts w:ascii="Times New Roman" w:hAnsi="Times New Roman" w:eastAsia="Times New Roman"/>
-                <w:b w:val="0"/>
-                <w:i w:val="0"/>
-                <w:color w:val="1E2F38"/>
-                <w:sz w:val="20"/>
-              </w:rPr>
-              <w:t>$20,000,000</w:t>
-            </w:r>
-          </w:p>
-        </w:tc>
-        <w:tc>
-          <w:tcPr>
-            <w:tcW w:type="dxa" w:w="2340"/>
-          </w:tcPr>
-          <w:p>
-            <w:r/>
-            <w:r>
-              <w:rPr>
-                <w:rFonts w:ascii="Times New Roman" w:hAnsi="Times New Roman" w:eastAsia="Times New Roman"/>
-                <w:b w:val="0"/>
-                <w:i w:val="0"/>
-                <w:color w:val="1E2F38"/>
-                <w:sz w:val="20"/>
-              </w:rPr>
-              <w:t>Contingency</w:t>
-            </w:r>
-          </w:p>
-        </w:tc>
-      </w:tr>
-      <w:tr>
-        <w:tc>
-          <w:tcPr>
-            <w:tcW w:type="dxa" w:w="2340"/>
-          </w:tcPr>
-          <w:p>
-            <w:r/>
-            <w:r>
-              <w:rPr>
-                <w:rFonts w:ascii="Times New Roman" w:hAnsi="Times New Roman" w:eastAsia="Times New Roman"/>
-                <w:b w:val="0"/>
-                <w:i w:val="0"/>
-                <w:color w:val="1E2F38"/>
-                <w:sz w:val="20"/>
-              </w:rPr>
-              <w:t>TOTAL Year 1</w:t>
+              <w:t>TOTAL Year 1 (SF-424A 4 rows)</w:t>
             </w:r>
           </w:p>
         </w:tc>
@@ -2459,7 +2385,7 @@
                 <w:color w:val="1E2F38"/>
                 <w:sz w:val="20"/>
               </w:rPr>
-              <w:t>All components</w:t>
+              <w:t>Equals Box 18a</w:t>
             </w:r>
           </w:p>
         </w:tc>

</xml_diff>